<commit_message>
Update : 3. Gestion de projet
</commit_message>
<xml_diff>
--- a/karotsch-tommy-fullstack.docx
+++ b/karotsch-tommy-fullstack.docx
@@ -104,12 +104,12 @@
             <wp:extent cx="6036000" cy="4521200"/>
             <wp:effectExtent b="0" l="0" r="0" t="0"/>
             <wp:wrapSquare wrapText="bothSides" distB="114300" distT="114300" distL="114300" distR="114300"/>
-            <wp:docPr id="13" name="image13.png"/>
+            <wp:docPr id="13" name="image3.png"/>
             <a:graphic>
               <a:graphicData uri="http://schemas.openxmlformats.org/drawingml/2006/picture">
                 <pic:pic>
                   <pic:nvPicPr>
-                    <pic:cNvPr id="0" name="image13.png"/>
+                    <pic:cNvPr id="0" name="image3.png"/>
                     <pic:cNvPicPr preferRelativeResize="0"/>
                   </pic:nvPicPr>
                   <pic:blipFill>
@@ -1904,12 +1904,12 @@
             <wp:extent cx="6036000" cy="2120900"/>
             <wp:effectExtent b="0" l="0" r="0" t="0"/>
             <wp:wrapSquare wrapText="bothSides" distB="0" distT="0" distL="0" distR="0"/>
-            <wp:docPr id="20" name="image19.png"/>
+            <wp:docPr id="20" name="image9.png"/>
             <a:graphic>
               <a:graphicData uri="http://schemas.openxmlformats.org/drawingml/2006/picture">
                 <pic:pic>
                   <pic:nvPicPr>
-                    <pic:cNvPr id="0" name="image19.png"/>
+                    <pic:cNvPr id="0" name="image9.png"/>
                     <pic:cNvPicPr preferRelativeResize="0"/>
                   </pic:nvPicPr>
                   <pic:blipFill>
@@ -2285,12 +2285,12 @@
             <wp:extent cx="6036000" cy="2438400"/>
             <wp:effectExtent b="0" l="0" r="0" t="0"/>
             <wp:wrapSquare wrapText="bothSides" distB="114300" distT="114300" distL="114300" distR="114300"/>
-            <wp:docPr id="17" name="image9.png"/>
+            <wp:docPr id="17" name="image17.png"/>
             <a:graphic>
               <a:graphicData uri="http://schemas.openxmlformats.org/drawingml/2006/picture">
                 <pic:pic>
                   <pic:nvPicPr>
-                    <pic:cNvPr id="0" name="image9.png"/>
+                    <pic:cNvPr id="0" name="image17.png"/>
                     <pic:cNvPicPr preferRelativeResize="0"/>
                   </pic:nvPicPr>
                   <pic:blipFill>
@@ -3684,11 +3684,7 @@
         <w:pStyle w:val="Heading2"/>
         <w:rPr>
           <w:rFonts w:ascii="Roboto" w:cs="Roboto" w:eastAsia="Roboto" w:hAnsi="Roboto"/>
-          <w:b w:val="1"/>
-          <w:bCs w:val="1"/>
-          <w:color w:val="74461d"/>
-          <w:sz w:val="30"/>
-          <w:szCs w:val="30"/>
+          <w:color w:val="f8933c"/>
         </w:rPr>
       </w:pPr>
       <w:bookmarkStart w:colFirst="0" w:colLast="0" w:name="_heading=h.5fglxbcdtmze" w:id="2"/>
@@ -3701,6 +3697,32 @@
         </w:rPr>
         <w:t xml:space="preserve">3.1 Planning de projet </w:t>
       </w:r>
+    </w:p>
+    <w:p>
+      <w:pPr>
+        <w:rPr/>
+      </w:pPr>
+      <w:r>
+        <w:rPr>
+          <w:rtl w:val="0"/>
+        </w:rPr>
+      </w:r>
+    </w:p>
+    <w:p>
+      <w:pPr>
+        <w:rPr/>
+      </w:pPr>
+      <w:r>
+        <w:rPr>
+          <w:rtl w:val="0"/>
+        </w:rPr>
+        <w:t xml:space="preserve">Je réalise ce projet seul, j’ai donc dû m’organiser proprement c’est pourquoi j’ai décidé de répartir les tâches à l’aide d’un diagramme de Gantt.</w:t>
+      </w:r>
+    </w:p>
+    <w:p>
+      <w:pPr>
+        <w:rPr/>
+      </w:pPr>
       <w:r>
         <w:rPr>
           <w:rtl w:val="0"/>
@@ -3735,12 +3757,12 @@
             <wp:extent cx="6036000" cy="2844800"/>
             <wp:effectExtent b="0" l="0" r="0" t="0"/>
             <wp:wrapSquare wrapText="bothSides" distB="0" distT="0" distL="0" distR="0"/>
-            <wp:docPr id="9" name="image10.png"/>
+            <wp:docPr id="9" name="image2.png"/>
             <a:graphic>
               <a:graphicData uri="http://schemas.openxmlformats.org/drawingml/2006/picture">
                 <pic:pic>
                   <pic:nvPicPr>
-                    <pic:cNvPr id="0" name="image10.png"/>
+                    <pic:cNvPr id="0" name="image2.png"/>
                     <pic:cNvPicPr preferRelativeResize="0"/>
                   </pic:nvPicPr>
                   <pic:blipFill>
@@ -4093,12 +4115,12 @@
             <wp:extent cx="6036000" cy="3286125"/>
             <wp:effectExtent b="0" l="0" r="0" t="0"/>
             <wp:wrapSquare wrapText="bothSides" distB="0" distT="0" distL="0" distR="0"/>
-            <wp:docPr id="16" name="image4.png"/>
+            <wp:docPr id="16" name="image12.png"/>
             <a:graphic>
               <a:graphicData uri="http://schemas.openxmlformats.org/drawingml/2006/picture">
                 <pic:pic>
                   <pic:nvPicPr>
-                    <pic:cNvPr id="0" name="image4.png"/>
+                    <pic:cNvPr id="0" name="image12.png"/>
                     <pic:cNvPicPr preferRelativeResize="0"/>
                   </pic:nvPicPr>
                   <pic:blipFill>
@@ -4196,12 +4218,12 @@
             <wp:extent cx="6038850" cy="3459305"/>
             <wp:effectExtent b="0" l="0" r="0" t="0"/>
             <wp:wrapSquare wrapText="bothSides" distB="0" distT="0" distL="0" distR="0"/>
-            <wp:docPr id="14" name="image17.png"/>
+            <wp:docPr id="14" name="image16.png"/>
             <a:graphic>
               <a:graphicData uri="http://schemas.openxmlformats.org/drawingml/2006/picture">
                 <pic:pic>
                   <pic:nvPicPr>
-                    <pic:cNvPr id="0" name="image17.png"/>
+                    <pic:cNvPr id="0" name="image16.png"/>
                     <pic:cNvPicPr preferRelativeResize="0"/>
                   </pic:nvPicPr>
                   <pic:blipFill>
@@ -4309,12 +4331,12 @@
             <wp:extent cx="5114925" cy="3676650"/>
             <wp:effectExtent b="0" l="0" r="0" t="0"/>
             <wp:wrapSquare wrapText="bothSides" distB="0" distT="0" distL="0" distR="0"/>
-            <wp:docPr id="3" name="image14.png"/>
+            <wp:docPr id="3" name="image11.png"/>
             <a:graphic>
               <a:graphicData uri="http://schemas.openxmlformats.org/drawingml/2006/picture">
                 <pic:pic>
                   <pic:nvPicPr>
-                    <pic:cNvPr id="0" name="image14.png"/>
+                    <pic:cNvPr id="0" name="image11.png"/>
                     <pic:cNvPicPr preferRelativeResize="0"/>
                   </pic:nvPicPr>
                   <pic:blipFill>
@@ -4511,12 +4533,12 @@
             <wp:extent cx="5076825" cy="4564835"/>
             <wp:effectExtent b="0" l="0" r="0" t="0"/>
             <wp:wrapSquare wrapText="bothSides" distB="0" distT="0" distL="0" distR="0"/>
-            <wp:docPr id="18" name="image7.png"/>
+            <wp:docPr id="18" name="image13.png"/>
             <a:graphic>
               <a:graphicData uri="http://schemas.openxmlformats.org/drawingml/2006/picture">
                 <pic:pic>
                   <pic:nvPicPr>
-                    <pic:cNvPr id="0" name="image7.png"/>
+                    <pic:cNvPr id="0" name="image13.png"/>
                     <pic:cNvPicPr preferRelativeResize="0"/>
                   </pic:nvPicPr>
                   <pic:blipFill>
@@ -4932,12 +4954,12 @@
             <wp:extent cx="6036000" cy="4000500"/>
             <wp:effectExtent b="0" l="0" r="0" t="0"/>
             <wp:wrapSquare wrapText="bothSides" distB="0" distT="0" distL="0" distR="0"/>
-            <wp:docPr id="11" name="image21.png"/>
+            <wp:docPr id="11" name="image20.png"/>
             <a:graphic>
               <a:graphicData uri="http://schemas.openxmlformats.org/drawingml/2006/picture">
                 <pic:pic>
                   <pic:nvPicPr>
-                    <pic:cNvPr id="0" name="image21.png"/>
+                    <pic:cNvPr id="0" name="image20.png"/>
                     <pic:cNvPicPr preferRelativeResize="0"/>
                   </pic:nvPicPr>
                   <pic:blipFill>
@@ -5165,12 +5187,12 @@
             <wp:extent cx="6036000" cy="5740400"/>
             <wp:effectExtent b="0" l="0" r="0" t="0"/>
             <wp:wrapSquare wrapText="bothSides" distB="114300" distT="114300" distL="114300" distR="114300"/>
-            <wp:docPr id="12" name="image20.png"/>
+            <wp:docPr id="12" name="image18.png"/>
             <a:graphic>
               <a:graphicData uri="http://schemas.openxmlformats.org/drawingml/2006/picture">
                 <pic:pic>
                   <pic:nvPicPr>
-                    <pic:cNvPr id="0" name="image20.png"/>
+                    <pic:cNvPr id="0" name="image18.png"/>
                     <pic:cNvPicPr preferRelativeResize="0"/>
                   </pic:nvPicPr>
                   <pic:blipFill>
@@ -5295,12 +5317,12 @@
             <wp:extent cx="6036000" cy="4546600"/>
             <wp:effectExtent b="0" l="0" r="0" t="0"/>
             <wp:wrapSquare wrapText="bothSides" distB="114300" distT="114300" distL="114300" distR="114300"/>
-            <wp:docPr id="15" name="image18.png"/>
+            <wp:docPr id="15" name="image19.png"/>
             <a:graphic>
               <a:graphicData uri="http://schemas.openxmlformats.org/drawingml/2006/picture">
                 <pic:pic>
                   <pic:nvPicPr>
-                    <pic:cNvPr id="0" name="image18.png"/>
+                    <pic:cNvPr id="0" name="image19.png"/>
                     <pic:cNvPicPr preferRelativeResize="0"/>
                   </pic:nvPicPr>
                   <pic:blipFill>
@@ -5551,12 +5573,12 @@
             <wp:extent cx="3486150" cy="2781300"/>
             <wp:effectExtent b="0" l="0" r="0" t="0"/>
             <wp:wrapSquare wrapText="bothSides" distB="0" distT="0" distL="0" distR="0"/>
-            <wp:docPr id="10" name="image3.png"/>
+            <wp:docPr id="10" name="image14.png"/>
             <a:graphic>
               <a:graphicData uri="http://schemas.openxmlformats.org/drawingml/2006/picture">
                 <pic:pic>
                   <pic:nvPicPr>
-                    <pic:cNvPr id="0" name="image3.png"/>
+                    <pic:cNvPr id="0" name="image14.png"/>
                     <pic:cNvPicPr preferRelativeResize="0"/>
                   </pic:nvPicPr>
                   <pic:blipFill>
@@ -5705,12 +5727,12 @@
             <wp:extent cx="3667125" cy="2686050"/>
             <wp:effectExtent b="0" l="0" r="0" t="0"/>
             <wp:wrapSquare wrapText="bothSides" distB="114300" distT="114300" distL="114300" distR="114300"/>
-            <wp:docPr id="4" name="image12.png"/>
+            <wp:docPr id="4" name="image1.png"/>
             <a:graphic>
               <a:graphicData uri="http://schemas.openxmlformats.org/drawingml/2006/picture">
                 <pic:pic>
                   <pic:nvPicPr>
-                    <pic:cNvPr id="0" name="image12.png"/>
+                    <pic:cNvPr id="0" name="image1.png"/>
                     <pic:cNvPicPr preferRelativeResize="0"/>
                   </pic:nvPicPr>
                   <pic:blipFill>
@@ -6033,12 +6055,12 @@
             <wp:extent cx="2971800" cy="2419350"/>
             <wp:effectExtent b="0" l="0" r="0" t="0"/>
             <wp:wrapSquare wrapText="bothSides" distB="114300" distT="114300" distL="114300" distR="114300"/>
-            <wp:docPr id="5" name="image11.png"/>
+            <wp:docPr id="5" name="image4.png"/>
             <a:graphic>
               <a:graphicData uri="http://schemas.openxmlformats.org/drawingml/2006/picture">
                 <pic:pic>
                   <pic:nvPicPr>
-                    <pic:cNvPr id="0" name="image11.png"/>
+                    <pic:cNvPr id="0" name="image4.png"/>
                     <pic:cNvPicPr preferRelativeResize="0"/>
                   </pic:nvPicPr>
                   <pic:blipFill>
@@ -6181,12 +6203,12 @@
             <wp:extent cx="4057650" cy="3362325"/>
             <wp:effectExtent b="0" l="0" r="0" t="0"/>
             <wp:wrapSquare wrapText="bothSides" distB="114300" distT="114300" distL="114300" distR="114300"/>
-            <wp:docPr id="6" name="image8.png"/>
+            <wp:docPr id="6" name="image7.png"/>
             <a:graphic>
               <a:graphicData uri="http://schemas.openxmlformats.org/drawingml/2006/picture">
                 <pic:pic>
                   <pic:nvPicPr>
-                    <pic:cNvPr id="0" name="image8.png"/>
+                    <pic:cNvPr id="0" name="image7.png"/>
                     <pic:cNvPicPr preferRelativeResize="0"/>
                   </pic:nvPicPr>
                   <pic:blipFill>
@@ -6526,12 +6548,12 @@
             <wp:extent cx="6036000" cy="5334000"/>
             <wp:effectExtent b="0" l="0" r="0" t="0"/>
             <wp:wrapSquare wrapText="bothSides" distB="114300" distT="114300" distL="114300" distR="114300"/>
-            <wp:docPr id="19" name="image15.png"/>
+            <wp:docPr id="19" name="image5.png"/>
             <a:graphic>
               <a:graphicData uri="http://schemas.openxmlformats.org/drawingml/2006/picture">
                 <pic:pic>
                   <pic:nvPicPr>
-                    <pic:cNvPr id="0" name="image15.png"/>
+                    <pic:cNvPr id="0" name="image5.png"/>
                     <pic:cNvPicPr preferRelativeResize="0"/>
                   </pic:nvPicPr>
                   <pic:blipFill>
@@ -6882,12 +6904,12 @@
             <wp:extent cx="4171950" cy="3600450"/>
             <wp:effectExtent b="0" l="0" r="0" t="0"/>
             <wp:wrapSquare wrapText="bothSides" distB="114300" distT="114300" distL="114300" distR="114300"/>
-            <wp:docPr id="8" name="image5.png"/>
+            <wp:docPr id="8" name="image21.png"/>
             <a:graphic>
               <a:graphicData uri="http://schemas.openxmlformats.org/drawingml/2006/picture">
                 <pic:pic>
                   <pic:nvPicPr>
-                    <pic:cNvPr id="0" name="image5.png"/>
+                    <pic:cNvPr id="0" name="image21.png"/>
                     <pic:cNvPicPr preferRelativeResize="0"/>
                   </pic:nvPicPr>
                   <pic:blipFill>
@@ -7953,12 +7975,12 @@
             <wp:extent cx="6036000" cy="4276725"/>
             <wp:effectExtent b="0" l="0" r="0" t="0"/>
             <wp:wrapSquare wrapText="bothSides" distB="114300" distT="114300" distL="114300" distR="114300"/>
-            <wp:docPr id="21" name="image16.png"/>
+            <wp:docPr id="21" name="image8.png"/>
             <a:graphic>
               <a:graphicData uri="http://schemas.openxmlformats.org/drawingml/2006/picture">
                 <pic:pic>
                   <pic:nvPicPr>
-                    <pic:cNvPr id="0" name="image16.png"/>
+                    <pic:cNvPr id="0" name="image8.png"/>
                     <pic:cNvPicPr preferRelativeResize="0"/>
                   </pic:nvPicPr>
                   <pic:blipFill>
@@ -8251,12 +8273,12 @@
             <wp:extent cx="6036000" cy="5575300"/>
             <wp:effectExtent b="0" l="0" r="0" t="0"/>
             <wp:wrapSquare wrapText="bothSides" distB="0" distT="0" distL="0" distR="0"/>
-            <wp:docPr id="2" name="image2.png"/>
+            <wp:docPr id="2" name="image15.png"/>
             <a:graphic>
               <a:graphicData uri="http://schemas.openxmlformats.org/drawingml/2006/picture">
                 <pic:pic>
                   <pic:nvPicPr>
-                    <pic:cNvPr id="0" name="image2.png"/>
+                    <pic:cNvPr id="0" name="image15.png"/>
                     <pic:cNvPicPr preferRelativeResize="0"/>
                   </pic:nvPicPr>
                   <pic:blipFill>
@@ -8359,12 +8381,12 @@
             <wp:extent cx="6036000" cy="1320800"/>
             <wp:effectExtent b="0" l="0" r="0" t="0"/>
             <wp:wrapSquare wrapText="bothSides" distB="0" distT="0" distL="0" distR="0"/>
-            <wp:docPr id="1" name="image1.png"/>
+            <wp:docPr id="1" name="image10.png"/>
             <a:graphic>
               <a:graphicData uri="http://schemas.openxmlformats.org/drawingml/2006/picture">
                 <pic:pic>
                   <pic:nvPicPr>
-                    <pic:cNvPr id="0" name="image1.png"/>
+                    <pic:cNvPr id="0" name="image10.png"/>
                     <pic:cNvPicPr preferRelativeResize="0"/>
                   </pic:nvPicPr>
                   <pic:blipFill>

</xml_diff>